<commit_message>
DOCS : Cours 20_04_2026 HTML/CSS
</commit_message>
<xml_diff>
--- a/Cours_Solo/PHP.docx
+++ b/Cours_Solo/PHP.docx
@@ -20644,17 +20644,431 @@
           <w:szCs w:val="24"/>
         </w:rPr>
       </w:pPr>
+    </w:p>
+    <w:p>
+      <w:pPr>
+        <w:pStyle w:val="Titre3"/>
+        <w:shd w:val="clear" w:color="auto" w:fill="FFFFFF"/>
+        <w:spacing w:line="540" w:lineRule="atLeast"/>
+        <w:rPr>
+          <w:rFonts w:ascii="Arial" w:hAnsi="Arial" w:cs="Arial"/>
+          <w:color w:val="271A38"/>
+        </w:rPr>
+      </w:pPr>
+      <w:r>
+        <w:rPr>
+          <w:rFonts w:ascii="Arial" w:hAnsi="Arial" w:cs="Arial"/>
+          <w:color w:val="271A38"/>
+        </w:rPr>
+        <w:t>En résumé</w:t>
+      </w:r>
+    </w:p>
+    <w:p>
+      <w:pPr>
+        <w:numPr>
+          <w:ilvl w:val="0"/>
+          <w:numId w:val="22"/>
+        </w:numPr>
+        <w:shd w:val="clear" w:color="auto" w:fill="FFFFFF"/>
+        <w:spacing w:before="100" w:beforeAutospacing="1" w:after="100" w:afterAutospacing="1" w:line="240" w:lineRule="auto"/>
+        <w:rPr>
+          <w:rFonts w:ascii="Arial" w:eastAsia="Times New Roman" w:hAnsi="Arial" w:cs="Arial"/>
+          <w:color w:val="271A38"/>
+          <w:sz w:val="24"/>
+          <w:szCs w:val="24"/>
+          <w:lang w:eastAsia="fr-FR"/>
+        </w:rPr>
+      </w:pPr>
+      <w:r>
+        <w:rPr>
+          <w:rFonts w:ascii="Arial" w:eastAsia="Times New Roman" w:hAnsi="Arial" w:cs="Arial"/>
+          <w:color w:val="271A38"/>
+          <w:sz w:val="24"/>
+          <w:szCs w:val="24"/>
+          <w:lang w:eastAsia="fr-FR"/>
+        </w:rPr>
+        <w:t xml:space="preserve">Les variables </w:t>
+      </w:r>
+      <w:proofErr w:type="spellStart"/>
+      <w:r>
+        <w:rPr>
+          <w:rFonts w:ascii="Arial" w:eastAsia="Times New Roman" w:hAnsi="Arial" w:cs="Arial"/>
+          <w:color w:val="271A38"/>
+          <w:sz w:val="24"/>
+          <w:szCs w:val="24"/>
+          <w:lang w:eastAsia="fr-FR"/>
+        </w:rPr>
+        <w:t>superglobales</w:t>
+      </w:r>
+      <w:proofErr w:type="spellEnd"/>
+      <w:r>
+        <w:rPr>
+          <w:rFonts w:ascii="Arial" w:eastAsia="Times New Roman" w:hAnsi="Arial" w:cs="Arial"/>
+          <w:color w:val="271A38"/>
+          <w:sz w:val="24"/>
+          <w:szCs w:val="24"/>
+          <w:lang w:eastAsia="fr-FR"/>
+        </w:rPr>
+        <w:t xml:space="preserve"> sont des variables automatiquement créées par PHP. Elles se présentent sous la forme de tableaux (</w:t>
+      </w:r>
+      <w:proofErr w:type="spellStart"/>
+      <w:r>
+        <w:rPr>
+          <w:rFonts w:ascii="Arial" w:eastAsia="Times New Roman" w:hAnsi="Arial" w:cs="Arial"/>
+          <w:color w:val="271A38"/>
+          <w:sz w:val="24"/>
+          <w:szCs w:val="24"/>
+          <w:lang w:eastAsia="fr-FR"/>
+        </w:rPr>
+        <w:t>arrays</w:t>
+      </w:r>
+      <w:proofErr w:type="spellEnd"/>
+      <w:r>
+        <w:rPr>
+          <w:rFonts w:ascii="Arial" w:eastAsia="Times New Roman" w:hAnsi="Arial" w:cs="Arial"/>
+          <w:color w:val="271A38"/>
+          <w:sz w:val="24"/>
+          <w:szCs w:val="24"/>
+          <w:lang w:eastAsia="fr-FR"/>
+        </w:rPr>
+        <w:t>) contenant différents types d'informations.</w:t>
+      </w:r>
+    </w:p>
+    <w:p>
+      <w:pPr>
+        <w:numPr>
+          <w:ilvl w:val="0"/>
+          <w:numId w:val="22"/>
+        </w:numPr>
+        <w:shd w:val="clear" w:color="auto" w:fill="FFFFFF"/>
+        <w:spacing w:before="100" w:beforeAutospacing="1" w:after="100" w:afterAutospacing="1" w:line="240" w:lineRule="auto"/>
+        <w:rPr>
+          <w:rFonts w:ascii="Arial" w:eastAsia="Times New Roman" w:hAnsi="Arial" w:cs="Arial"/>
+          <w:color w:val="271A38"/>
+          <w:sz w:val="24"/>
+          <w:szCs w:val="24"/>
+          <w:lang w:eastAsia="fr-FR"/>
+        </w:rPr>
+      </w:pPr>
+      <w:r>
+        <w:rPr>
+          <w:rFonts w:ascii="Arial" w:eastAsia="Times New Roman" w:hAnsi="Arial" w:cs="Arial"/>
+          <w:color w:val="271A38"/>
+          <w:sz w:val="24"/>
+          <w:szCs w:val="24"/>
+          <w:lang w:eastAsia="fr-FR"/>
+        </w:rPr>
+        <w:t xml:space="preserve">Dans les chapitres précédents, nous avons découvert deux </w:t>
+      </w:r>
+      <w:proofErr w:type="spellStart"/>
+      <w:r>
+        <w:rPr>
+          <w:rFonts w:ascii="Arial" w:eastAsia="Times New Roman" w:hAnsi="Arial" w:cs="Arial"/>
+          <w:color w:val="271A38"/>
+          <w:sz w:val="24"/>
+          <w:szCs w:val="24"/>
+          <w:lang w:eastAsia="fr-FR"/>
+        </w:rPr>
+        <w:t>superglobales</w:t>
+      </w:r>
+      <w:proofErr w:type="spellEnd"/>
+      <w:r>
+        <w:rPr>
+          <w:rFonts w:ascii="Arial" w:eastAsia="Times New Roman" w:hAnsi="Arial" w:cs="Arial"/>
+          <w:color w:val="271A38"/>
+          <w:sz w:val="24"/>
+          <w:szCs w:val="24"/>
+          <w:lang w:eastAsia="fr-FR"/>
+        </w:rPr>
+        <w:t xml:space="preserve"> essentielles :  </w:t>
+      </w:r>
+      <w:r>
+        <w:rPr>
+          <w:rFonts w:ascii="Courier New" w:eastAsia="Times New Roman" w:hAnsi="Courier New" w:cs="Courier New"/>
+          <w:color w:val="271A38"/>
+          <w:sz w:val="20"/>
+          <w:szCs w:val="20"/>
+          <w:lang w:eastAsia="fr-FR"/>
+        </w:rPr>
+        <w:t>$_GET</w:t>
+      </w:r>
+      <w:r>
+        <w:rPr>
+          <w:rFonts w:ascii="Arial" w:eastAsia="Times New Roman" w:hAnsi="Arial" w:cs="Arial"/>
+          <w:color w:val="271A38"/>
+          <w:sz w:val="24"/>
+          <w:szCs w:val="24"/>
+          <w:lang w:eastAsia="fr-FR"/>
+        </w:rPr>
+        <w:t> (qui contient les données issues de l'URL) et </w:t>
+      </w:r>
+      <w:r>
+        <w:rPr>
+          <w:rFonts w:ascii="Courier New" w:eastAsia="Times New Roman" w:hAnsi="Courier New" w:cs="Courier New"/>
+          <w:color w:val="271A38"/>
+          <w:sz w:val="20"/>
+          <w:szCs w:val="20"/>
+          <w:lang w:eastAsia="fr-FR"/>
+        </w:rPr>
+        <w:t>$_POST</w:t>
+      </w:r>
+      <w:r>
+        <w:rPr>
+          <w:rFonts w:ascii="Arial" w:eastAsia="Times New Roman" w:hAnsi="Arial" w:cs="Arial"/>
+          <w:color w:val="271A38"/>
+          <w:sz w:val="24"/>
+          <w:szCs w:val="24"/>
+          <w:lang w:eastAsia="fr-FR"/>
+        </w:rPr>
+        <w:t> (qui contient les données issues d'un formulaire).</w:t>
+      </w:r>
+    </w:p>
+    <w:p>
+      <w:pPr>
+        <w:numPr>
+          <w:ilvl w:val="0"/>
+          <w:numId w:val="22"/>
+        </w:numPr>
+        <w:shd w:val="clear" w:color="auto" w:fill="FFFFFF"/>
+        <w:spacing w:before="100" w:beforeAutospacing="1" w:after="100" w:afterAutospacing="1" w:line="240" w:lineRule="auto"/>
+        <w:rPr>
+          <w:rFonts w:ascii="Arial" w:eastAsia="Times New Roman" w:hAnsi="Arial" w:cs="Arial"/>
+          <w:color w:val="271A38"/>
+          <w:sz w:val="24"/>
+          <w:szCs w:val="24"/>
+          <w:lang w:eastAsia="fr-FR"/>
+        </w:rPr>
+      </w:pPr>
+      <w:r>
+        <w:rPr>
+          <w:rFonts w:ascii="Arial" w:eastAsia="Times New Roman" w:hAnsi="Arial" w:cs="Arial"/>
+          <w:color w:val="271A38"/>
+          <w:sz w:val="24"/>
+          <w:szCs w:val="24"/>
+          <w:lang w:eastAsia="fr-FR"/>
+        </w:rPr>
+        <w:t xml:space="preserve">La </w:t>
+      </w:r>
+      <w:proofErr w:type="spellStart"/>
+      <w:r>
+        <w:rPr>
+          <w:rFonts w:ascii="Arial" w:eastAsia="Times New Roman" w:hAnsi="Arial" w:cs="Arial"/>
+          <w:color w:val="271A38"/>
+          <w:sz w:val="24"/>
+          <w:szCs w:val="24"/>
+          <w:lang w:eastAsia="fr-FR"/>
+        </w:rPr>
+        <w:t>superglobale</w:t>
+      </w:r>
+      <w:proofErr w:type="spellEnd"/>
+      <w:r>
+        <w:rPr>
+          <w:rFonts w:ascii="Arial" w:eastAsia="Times New Roman" w:hAnsi="Arial" w:cs="Arial"/>
+          <w:color w:val="271A38"/>
+          <w:sz w:val="24"/>
+          <w:szCs w:val="24"/>
+          <w:lang w:eastAsia="fr-FR"/>
+        </w:rPr>
+        <w:t> </w:t>
+      </w:r>
+      <w:r>
+        <w:rPr>
+          <w:rFonts w:ascii="Courier New" w:eastAsia="Times New Roman" w:hAnsi="Courier New" w:cs="Courier New"/>
+          <w:color w:val="271A38"/>
+          <w:sz w:val="20"/>
+          <w:szCs w:val="20"/>
+          <w:lang w:eastAsia="fr-FR"/>
+        </w:rPr>
+        <w:t>$_SESSION</w:t>
+      </w:r>
+      <w:r>
+        <w:rPr>
+          <w:rFonts w:ascii="Arial" w:eastAsia="Times New Roman" w:hAnsi="Arial" w:cs="Arial"/>
+          <w:color w:val="271A38"/>
+          <w:sz w:val="24"/>
+          <w:szCs w:val="24"/>
+          <w:lang w:eastAsia="fr-FR"/>
+        </w:rPr>
+        <w:t xml:space="preserve"> permet de stocker des informations qui seront automatiquement transmises de page en page pendant toute la durée de visite d'un internaute sur votre site. Il faut au préalable activer les sessions en appelant la </w:t>
+      </w:r>
+      <w:proofErr w:type="gramStart"/>
+      <w:r>
+        <w:rPr>
+          <w:rFonts w:ascii="Arial" w:eastAsia="Times New Roman" w:hAnsi="Arial" w:cs="Arial"/>
+          <w:color w:val="271A38"/>
+          <w:sz w:val="24"/>
+          <w:szCs w:val="24"/>
+          <w:lang w:eastAsia="fr-FR"/>
+        </w:rPr>
+        <w:t>fonction  </w:t>
+      </w:r>
+      <w:proofErr w:type="spellStart"/>
+      <w:r>
+        <w:rPr>
+          <w:rFonts w:ascii="Courier New" w:eastAsia="Times New Roman" w:hAnsi="Courier New" w:cs="Courier New"/>
+          <w:color w:val="271A38"/>
+          <w:sz w:val="20"/>
+          <w:szCs w:val="20"/>
+          <w:lang w:eastAsia="fr-FR"/>
+        </w:rPr>
+        <w:t>session</w:t>
+      </w:r>
+      <w:proofErr w:type="gramEnd"/>
+      <w:r>
+        <w:rPr>
+          <w:rFonts w:ascii="Courier New" w:eastAsia="Times New Roman" w:hAnsi="Courier New" w:cs="Courier New"/>
+          <w:color w:val="271A38"/>
+          <w:sz w:val="20"/>
+          <w:szCs w:val="20"/>
+          <w:lang w:eastAsia="fr-FR"/>
+        </w:rPr>
+        <w:t>_start</w:t>
+      </w:r>
+      <w:proofErr w:type="spellEnd"/>
+      <w:r>
+        <w:rPr>
+          <w:rFonts w:ascii="Courier New" w:eastAsia="Times New Roman" w:hAnsi="Courier New" w:cs="Courier New"/>
+          <w:color w:val="271A38"/>
+          <w:sz w:val="20"/>
+          <w:szCs w:val="20"/>
+          <w:lang w:eastAsia="fr-FR"/>
+        </w:rPr>
+        <w:t>()</w:t>
+      </w:r>
+      <w:r>
+        <w:rPr>
+          <w:rFonts w:ascii="Arial" w:eastAsia="Times New Roman" w:hAnsi="Arial" w:cs="Arial"/>
+          <w:color w:val="271A38"/>
+          <w:sz w:val="24"/>
+          <w:szCs w:val="24"/>
+          <w:lang w:eastAsia="fr-FR"/>
+        </w:rPr>
+        <w:t> .</w:t>
+      </w:r>
+    </w:p>
+    <w:p>
+      <w:pPr>
+        <w:numPr>
+          <w:ilvl w:val="0"/>
+          <w:numId w:val="22"/>
+        </w:numPr>
+        <w:shd w:val="clear" w:color="auto" w:fill="FFFFFF"/>
+        <w:spacing w:before="100" w:beforeAutospacing="1" w:after="100" w:afterAutospacing="1" w:line="240" w:lineRule="auto"/>
+        <w:rPr>
+          <w:rFonts w:ascii="Arial" w:eastAsia="Times New Roman" w:hAnsi="Arial" w:cs="Arial"/>
+          <w:color w:val="271A38"/>
+          <w:sz w:val="24"/>
+          <w:szCs w:val="24"/>
+          <w:lang w:eastAsia="fr-FR"/>
+        </w:rPr>
+      </w:pPr>
+      <w:r>
+        <w:rPr>
+          <w:rFonts w:ascii="Arial" w:eastAsia="Times New Roman" w:hAnsi="Arial" w:cs="Arial"/>
+          <w:color w:val="271A38"/>
+          <w:sz w:val="24"/>
+          <w:szCs w:val="24"/>
+          <w:lang w:eastAsia="fr-FR"/>
+        </w:rPr>
+        <w:t xml:space="preserve">La </w:t>
+      </w:r>
+      <w:proofErr w:type="spellStart"/>
+      <w:r>
+        <w:rPr>
+          <w:rFonts w:ascii="Arial" w:eastAsia="Times New Roman" w:hAnsi="Arial" w:cs="Arial"/>
+          <w:color w:val="271A38"/>
+          <w:sz w:val="24"/>
+          <w:szCs w:val="24"/>
+          <w:lang w:eastAsia="fr-FR"/>
+        </w:rPr>
+        <w:t>superglobale</w:t>
+      </w:r>
+      <w:proofErr w:type="spellEnd"/>
+      <w:r>
+        <w:rPr>
+          <w:rFonts w:ascii="Arial" w:eastAsia="Times New Roman" w:hAnsi="Arial" w:cs="Arial"/>
+          <w:color w:val="271A38"/>
+          <w:sz w:val="24"/>
+          <w:szCs w:val="24"/>
+          <w:lang w:eastAsia="fr-FR"/>
+        </w:rPr>
+        <w:t> </w:t>
+      </w:r>
+      <w:r>
+        <w:rPr>
+          <w:rFonts w:ascii="Courier New" w:eastAsia="Times New Roman" w:hAnsi="Courier New" w:cs="Courier New"/>
+          <w:color w:val="271A38"/>
+          <w:sz w:val="20"/>
+          <w:szCs w:val="20"/>
+          <w:lang w:eastAsia="fr-FR"/>
+        </w:rPr>
+        <w:t>$_COOKIE</w:t>
+      </w:r>
+      <w:r>
+        <w:rPr>
+          <w:rFonts w:ascii="Arial" w:eastAsia="Times New Roman" w:hAnsi="Arial" w:cs="Arial"/>
+          <w:color w:val="271A38"/>
+          <w:sz w:val="24"/>
+          <w:szCs w:val="24"/>
+          <w:lang w:eastAsia="fr-FR"/>
+        </w:rPr>
+        <w:t xml:space="preserve"> représente le contenu de tous les cookies stockés par votre site sur l'ordinateur du visiteur. Les cookies sont de petits fichiers que l'on peut écrire sur la machine du visiteur pour retenir par exemple son nom. On crée un cookie avec la </w:t>
+      </w:r>
+      <w:proofErr w:type="gramStart"/>
+      <w:r>
+        <w:rPr>
+          <w:rFonts w:ascii="Arial" w:eastAsia="Times New Roman" w:hAnsi="Arial" w:cs="Arial"/>
+          <w:color w:val="271A38"/>
+          <w:sz w:val="24"/>
+          <w:szCs w:val="24"/>
+          <w:lang w:eastAsia="fr-FR"/>
+        </w:rPr>
+        <w:t>fonction  </w:t>
+      </w:r>
+      <w:proofErr w:type="spellStart"/>
+      <w:r>
+        <w:rPr>
+          <w:rFonts w:ascii="Courier New" w:eastAsia="Times New Roman" w:hAnsi="Courier New" w:cs="Courier New"/>
+          <w:color w:val="271A38"/>
+          <w:sz w:val="20"/>
+          <w:szCs w:val="20"/>
+          <w:lang w:eastAsia="fr-FR"/>
+        </w:rPr>
+        <w:t>setcookie</w:t>
+      </w:r>
+      <w:proofErr w:type="spellEnd"/>
+      <w:proofErr w:type="gramEnd"/>
+      <w:r>
+        <w:rPr>
+          <w:rFonts w:ascii="Courier New" w:eastAsia="Times New Roman" w:hAnsi="Courier New" w:cs="Courier New"/>
+          <w:color w:val="271A38"/>
+          <w:sz w:val="20"/>
+          <w:szCs w:val="20"/>
+          <w:lang w:eastAsia="fr-FR"/>
+        </w:rPr>
+        <w:t>()</w:t>
+      </w:r>
+      <w:r>
+        <w:rPr>
+          <w:rFonts w:ascii="Arial" w:eastAsia="Times New Roman" w:hAnsi="Arial" w:cs="Arial"/>
+          <w:color w:val="271A38"/>
+          <w:sz w:val="24"/>
+          <w:szCs w:val="24"/>
+          <w:lang w:eastAsia="fr-FR"/>
+        </w:rPr>
+        <w:t> .</w:t>
+      </w:r>
+    </w:p>
+    <w:p>
+      <w:pPr>
+        <w:rPr>
+          <w:rFonts w:cstheme="minorHAnsi"/>
+          <w:sz w:val="24"/>
+          <w:szCs w:val="24"/>
+        </w:rPr>
+      </w:pPr>
       <w:bookmarkStart w:id="0" w:name="_GoBack"/>
       <w:bookmarkEnd w:id="0"/>
-    </w:p>
-    <w:p>
-      <w:pPr>
-        <w:rPr>
-          <w:rFonts w:cstheme="minorHAnsi"/>
-          <w:sz w:val="24"/>
-          <w:szCs w:val="24"/>
-        </w:rPr>
-      </w:pPr>
     </w:p>
     <w:p>
       <w:pPr>
@@ -23370,122 +23784,9 @@
     </w:lvl>
   </w:abstractNum>
   <w:abstractNum w:abstractNumId="18" w15:restartNumberingAfterBreak="0">
-    <w:nsid w:val="650660C9"/>
+    <w:nsid w:val="605E3E62"/>
     <w:multiLevelType w:val="multilevel"/>
-    <w:tmpl w:val="944470DC"/>
-    <w:lvl w:ilvl="0">
-      <w:start w:val="1"/>
-      <w:numFmt w:val="decimal"/>
-      <w:lvlText w:val="%1."/>
-      <w:lvlJc w:val="left"/>
-      <w:pPr>
-        <w:tabs>
-          <w:tab w:val="num" w:pos="720"/>
-        </w:tabs>
-        <w:ind w:left="720" w:hanging="360"/>
-      </w:pPr>
-    </w:lvl>
-    <w:lvl w:ilvl="1" w:tentative="1">
-      <w:start w:val="1"/>
-      <w:numFmt w:val="decimal"/>
-      <w:lvlText w:val="%2."/>
-      <w:lvlJc w:val="left"/>
-      <w:pPr>
-        <w:tabs>
-          <w:tab w:val="num" w:pos="1440"/>
-        </w:tabs>
-        <w:ind w:left="1440" w:hanging="360"/>
-      </w:pPr>
-    </w:lvl>
-    <w:lvl w:ilvl="2" w:tentative="1">
-      <w:start w:val="1"/>
-      <w:numFmt w:val="decimal"/>
-      <w:lvlText w:val="%3."/>
-      <w:lvlJc w:val="left"/>
-      <w:pPr>
-        <w:tabs>
-          <w:tab w:val="num" w:pos="2160"/>
-        </w:tabs>
-        <w:ind w:left="2160" w:hanging="360"/>
-      </w:pPr>
-    </w:lvl>
-    <w:lvl w:ilvl="3" w:tentative="1">
-      <w:start w:val="1"/>
-      <w:numFmt w:val="decimal"/>
-      <w:lvlText w:val="%4."/>
-      <w:lvlJc w:val="left"/>
-      <w:pPr>
-        <w:tabs>
-          <w:tab w:val="num" w:pos="2880"/>
-        </w:tabs>
-        <w:ind w:left="2880" w:hanging="360"/>
-      </w:pPr>
-    </w:lvl>
-    <w:lvl w:ilvl="4" w:tentative="1">
-      <w:start w:val="1"/>
-      <w:numFmt w:val="decimal"/>
-      <w:lvlText w:val="%5."/>
-      <w:lvlJc w:val="left"/>
-      <w:pPr>
-        <w:tabs>
-          <w:tab w:val="num" w:pos="3600"/>
-        </w:tabs>
-        <w:ind w:left="3600" w:hanging="360"/>
-      </w:pPr>
-    </w:lvl>
-    <w:lvl w:ilvl="5" w:tentative="1">
-      <w:start w:val="1"/>
-      <w:numFmt w:val="decimal"/>
-      <w:lvlText w:val="%6."/>
-      <w:lvlJc w:val="left"/>
-      <w:pPr>
-        <w:tabs>
-          <w:tab w:val="num" w:pos="4320"/>
-        </w:tabs>
-        <w:ind w:left="4320" w:hanging="360"/>
-      </w:pPr>
-    </w:lvl>
-    <w:lvl w:ilvl="6" w:tentative="1">
-      <w:start w:val="1"/>
-      <w:numFmt w:val="decimal"/>
-      <w:lvlText w:val="%7."/>
-      <w:lvlJc w:val="left"/>
-      <w:pPr>
-        <w:tabs>
-          <w:tab w:val="num" w:pos="5040"/>
-        </w:tabs>
-        <w:ind w:left="5040" w:hanging="360"/>
-      </w:pPr>
-    </w:lvl>
-    <w:lvl w:ilvl="7" w:tentative="1">
-      <w:start w:val="1"/>
-      <w:numFmt w:val="decimal"/>
-      <w:lvlText w:val="%8."/>
-      <w:lvlJc w:val="left"/>
-      <w:pPr>
-        <w:tabs>
-          <w:tab w:val="num" w:pos="5760"/>
-        </w:tabs>
-        <w:ind w:left="5760" w:hanging="360"/>
-      </w:pPr>
-    </w:lvl>
-    <w:lvl w:ilvl="8" w:tentative="1">
-      <w:start w:val="1"/>
-      <w:numFmt w:val="decimal"/>
-      <w:lvlText w:val="%9."/>
-      <w:lvlJc w:val="left"/>
-      <w:pPr>
-        <w:tabs>
-          <w:tab w:val="num" w:pos="6480"/>
-        </w:tabs>
-        <w:ind w:left="6480" w:hanging="360"/>
-      </w:pPr>
-    </w:lvl>
-  </w:abstractNum>
-  <w:abstractNum w:abstractNumId="19" w15:restartNumberingAfterBreak="0">
-    <w:nsid w:val="6F793546"/>
-    <w:multiLevelType w:val="multilevel"/>
-    <w:tmpl w:val="FB1C1D20"/>
+    <w:tmpl w:val="F076A45E"/>
     <w:lvl w:ilvl="0">
       <w:start w:val="1"/>
       <w:numFmt w:val="bullet"/>
@@ -23631,7 +23932,269 @@
       </w:rPr>
     </w:lvl>
   </w:abstractNum>
+  <w:abstractNum w:abstractNumId="19" w15:restartNumberingAfterBreak="0">
+    <w:nsid w:val="650660C9"/>
+    <w:multiLevelType w:val="multilevel"/>
+    <w:tmpl w:val="944470DC"/>
+    <w:lvl w:ilvl="0">
+      <w:start w:val="1"/>
+      <w:numFmt w:val="decimal"/>
+      <w:lvlText w:val="%1."/>
+      <w:lvlJc w:val="left"/>
+      <w:pPr>
+        <w:tabs>
+          <w:tab w:val="num" w:pos="720"/>
+        </w:tabs>
+        <w:ind w:left="720" w:hanging="360"/>
+      </w:pPr>
+    </w:lvl>
+    <w:lvl w:ilvl="1" w:tentative="1">
+      <w:start w:val="1"/>
+      <w:numFmt w:val="decimal"/>
+      <w:lvlText w:val="%2."/>
+      <w:lvlJc w:val="left"/>
+      <w:pPr>
+        <w:tabs>
+          <w:tab w:val="num" w:pos="1440"/>
+        </w:tabs>
+        <w:ind w:left="1440" w:hanging="360"/>
+      </w:pPr>
+    </w:lvl>
+    <w:lvl w:ilvl="2" w:tentative="1">
+      <w:start w:val="1"/>
+      <w:numFmt w:val="decimal"/>
+      <w:lvlText w:val="%3."/>
+      <w:lvlJc w:val="left"/>
+      <w:pPr>
+        <w:tabs>
+          <w:tab w:val="num" w:pos="2160"/>
+        </w:tabs>
+        <w:ind w:left="2160" w:hanging="360"/>
+      </w:pPr>
+    </w:lvl>
+    <w:lvl w:ilvl="3" w:tentative="1">
+      <w:start w:val="1"/>
+      <w:numFmt w:val="decimal"/>
+      <w:lvlText w:val="%4."/>
+      <w:lvlJc w:val="left"/>
+      <w:pPr>
+        <w:tabs>
+          <w:tab w:val="num" w:pos="2880"/>
+        </w:tabs>
+        <w:ind w:left="2880" w:hanging="360"/>
+      </w:pPr>
+    </w:lvl>
+    <w:lvl w:ilvl="4" w:tentative="1">
+      <w:start w:val="1"/>
+      <w:numFmt w:val="decimal"/>
+      <w:lvlText w:val="%5."/>
+      <w:lvlJc w:val="left"/>
+      <w:pPr>
+        <w:tabs>
+          <w:tab w:val="num" w:pos="3600"/>
+        </w:tabs>
+        <w:ind w:left="3600" w:hanging="360"/>
+      </w:pPr>
+    </w:lvl>
+    <w:lvl w:ilvl="5" w:tentative="1">
+      <w:start w:val="1"/>
+      <w:numFmt w:val="decimal"/>
+      <w:lvlText w:val="%6."/>
+      <w:lvlJc w:val="left"/>
+      <w:pPr>
+        <w:tabs>
+          <w:tab w:val="num" w:pos="4320"/>
+        </w:tabs>
+        <w:ind w:left="4320" w:hanging="360"/>
+      </w:pPr>
+    </w:lvl>
+    <w:lvl w:ilvl="6" w:tentative="1">
+      <w:start w:val="1"/>
+      <w:numFmt w:val="decimal"/>
+      <w:lvlText w:val="%7."/>
+      <w:lvlJc w:val="left"/>
+      <w:pPr>
+        <w:tabs>
+          <w:tab w:val="num" w:pos="5040"/>
+        </w:tabs>
+        <w:ind w:left="5040" w:hanging="360"/>
+      </w:pPr>
+    </w:lvl>
+    <w:lvl w:ilvl="7" w:tentative="1">
+      <w:start w:val="1"/>
+      <w:numFmt w:val="decimal"/>
+      <w:lvlText w:val="%8."/>
+      <w:lvlJc w:val="left"/>
+      <w:pPr>
+        <w:tabs>
+          <w:tab w:val="num" w:pos="5760"/>
+        </w:tabs>
+        <w:ind w:left="5760" w:hanging="360"/>
+      </w:pPr>
+    </w:lvl>
+    <w:lvl w:ilvl="8" w:tentative="1">
+      <w:start w:val="1"/>
+      <w:numFmt w:val="decimal"/>
+      <w:lvlText w:val="%9."/>
+      <w:lvlJc w:val="left"/>
+      <w:pPr>
+        <w:tabs>
+          <w:tab w:val="num" w:pos="6480"/>
+        </w:tabs>
+        <w:ind w:left="6480" w:hanging="360"/>
+      </w:pPr>
+    </w:lvl>
+  </w:abstractNum>
   <w:abstractNum w:abstractNumId="20" w15:restartNumberingAfterBreak="0">
+    <w:nsid w:val="6F793546"/>
+    <w:multiLevelType w:val="multilevel"/>
+    <w:tmpl w:val="FB1C1D20"/>
+    <w:lvl w:ilvl="0">
+      <w:start w:val="1"/>
+      <w:numFmt w:val="bullet"/>
+      <w:lvlText w:val=""/>
+      <w:lvlJc w:val="left"/>
+      <w:pPr>
+        <w:tabs>
+          <w:tab w:val="num" w:pos="720"/>
+        </w:tabs>
+        <w:ind w:left="720" w:hanging="360"/>
+      </w:pPr>
+      <w:rPr>
+        <w:rFonts w:ascii="Symbol" w:hAnsi="Symbol" w:hint="default"/>
+        <w:sz w:val="20"/>
+      </w:rPr>
+    </w:lvl>
+    <w:lvl w:ilvl="1" w:tentative="1">
+      <w:start w:val="1"/>
+      <w:numFmt w:val="bullet"/>
+      <w:lvlText w:val="o"/>
+      <w:lvlJc w:val="left"/>
+      <w:pPr>
+        <w:tabs>
+          <w:tab w:val="num" w:pos="1440"/>
+        </w:tabs>
+        <w:ind w:left="1440" w:hanging="360"/>
+      </w:pPr>
+      <w:rPr>
+        <w:rFonts w:ascii="Courier New" w:hAnsi="Courier New" w:hint="default"/>
+        <w:sz w:val="20"/>
+      </w:rPr>
+    </w:lvl>
+    <w:lvl w:ilvl="2" w:tentative="1">
+      <w:start w:val="1"/>
+      <w:numFmt w:val="bullet"/>
+      <w:lvlText w:val=""/>
+      <w:lvlJc w:val="left"/>
+      <w:pPr>
+        <w:tabs>
+          <w:tab w:val="num" w:pos="2160"/>
+        </w:tabs>
+        <w:ind w:left="2160" w:hanging="360"/>
+      </w:pPr>
+      <w:rPr>
+        <w:rFonts w:ascii="Wingdings" w:hAnsi="Wingdings" w:hint="default"/>
+        <w:sz w:val="20"/>
+      </w:rPr>
+    </w:lvl>
+    <w:lvl w:ilvl="3" w:tentative="1">
+      <w:start w:val="1"/>
+      <w:numFmt w:val="bullet"/>
+      <w:lvlText w:val=""/>
+      <w:lvlJc w:val="left"/>
+      <w:pPr>
+        <w:tabs>
+          <w:tab w:val="num" w:pos="2880"/>
+        </w:tabs>
+        <w:ind w:left="2880" w:hanging="360"/>
+      </w:pPr>
+      <w:rPr>
+        <w:rFonts w:ascii="Wingdings" w:hAnsi="Wingdings" w:hint="default"/>
+        <w:sz w:val="20"/>
+      </w:rPr>
+    </w:lvl>
+    <w:lvl w:ilvl="4" w:tentative="1">
+      <w:start w:val="1"/>
+      <w:numFmt w:val="bullet"/>
+      <w:lvlText w:val=""/>
+      <w:lvlJc w:val="left"/>
+      <w:pPr>
+        <w:tabs>
+          <w:tab w:val="num" w:pos="3600"/>
+        </w:tabs>
+        <w:ind w:left="3600" w:hanging="360"/>
+      </w:pPr>
+      <w:rPr>
+        <w:rFonts w:ascii="Wingdings" w:hAnsi="Wingdings" w:hint="default"/>
+        <w:sz w:val="20"/>
+      </w:rPr>
+    </w:lvl>
+    <w:lvl w:ilvl="5" w:tentative="1">
+      <w:start w:val="1"/>
+      <w:numFmt w:val="bullet"/>
+      <w:lvlText w:val=""/>
+      <w:lvlJc w:val="left"/>
+      <w:pPr>
+        <w:tabs>
+          <w:tab w:val="num" w:pos="4320"/>
+        </w:tabs>
+        <w:ind w:left="4320" w:hanging="360"/>
+      </w:pPr>
+      <w:rPr>
+        <w:rFonts w:ascii="Wingdings" w:hAnsi="Wingdings" w:hint="default"/>
+        <w:sz w:val="20"/>
+      </w:rPr>
+    </w:lvl>
+    <w:lvl w:ilvl="6" w:tentative="1">
+      <w:start w:val="1"/>
+      <w:numFmt w:val="bullet"/>
+      <w:lvlText w:val=""/>
+      <w:lvlJc w:val="left"/>
+      <w:pPr>
+        <w:tabs>
+          <w:tab w:val="num" w:pos="5040"/>
+        </w:tabs>
+        <w:ind w:left="5040" w:hanging="360"/>
+      </w:pPr>
+      <w:rPr>
+        <w:rFonts w:ascii="Wingdings" w:hAnsi="Wingdings" w:hint="default"/>
+        <w:sz w:val="20"/>
+      </w:rPr>
+    </w:lvl>
+    <w:lvl w:ilvl="7" w:tentative="1">
+      <w:start w:val="1"/>
+      <w:numFmt w:val="bullet"/>
+      <w:lvlText w:val=""/>
+      <w:lvlJc w:val="left"/>
+      <w:pPr>
+        <w:tabs>
+          <w:tab w:val="num" w:pos="5760"/>
+        </w:tabs>
+        <w:ind w:left="5760" w:hanging="360"/>
+      </w:pPr>
+      <w:rPr>
+        <w:rFonts w:ascii="Wingdings" w:hAnsi="Wingdings" w:hint="default"/>
+        <w:sz w:val="20"/>
+      </w:rPr>
+    </w:lvl>
+    <w:lvl w:ilvl="8" w:tentative="1">
+      <w:start w:val="1"/>
+      <w:numFmt w:val="bullet"/>
+      <w:lvlText w:val=""/>
+      <w:lvlJc w:val="left"/>
+      <w:pPr>
+        <w:tabs>
+          <w:tab w:val="num" w:pos="6480"/>
+        </w:tabs>
+        <w:ind w:left="6480" w:hanging="360"/>
+      </w:pPr>
+      <w:rPr>
+        <w:rFonts w:ascii="Wingdings" w:hAnsi="Wingdings" w:hint="default"/>
+        <w:sz w:val="20"/>
+      </w:rPr>
+    </w:lvl>
+  </w:abstractNum>
+  <w:abstractNum w:abstractNumId="21" w15:restartNumberingAfterBreak="0">
     <w:nsid w:val="784720A1"/>
     <w:multiLevelType w:val="hybridMultilevel"/>
     <w:tmpl w:val="9F7E31E0"/>
@@ -23745,7 +24308,7 @@
     <w:abstractNumId w:val="1"/>
   </w:num>
   <w:num w:numId="9">
-    <w:abstractNumId w:val="19"/>
+    <w:abstractNumId w:val="20"/>
   </w:num>
   <w:num w:numId="10">
     <w:abstractNumId w:val="0"/>
@@ -23766,10 +24329,10 @@
     <w:abstractNumId w:val="16"/>
   </w:num>
   <w:num w:numId="16">
-    <w:abstractNumId w:val="20"/>
+    <w:abstractNumId w:val="21"/>
   </w:num>
   <w:num w:numId="17">
-    <w:abstractNumId w:val="18"/>
+    <w:abstractNumId w:val="19"/>
   </w:num>
   <w:num w:numId="18">
     <w:abstractNumId w:val="8"/>
@@ -23782,6 +24345,9 @@
   </w:num>
   <w:num w:numId="21">
     <w:abstractNumId w:val="3"/>
+  </w:num>
+  <w:num w:numId="22">
+    <w:abstractNumId w:val="18"/>
   </w:num>
 </w:numbering>
 </file>

</xml_diff>